<commit_message>
practice react and add some JS notes, react before state
</commit_message>
<xml_diff>
--- a/Java Script Note.docx
+++ b/Java Script Note.docx
@@ -30,15 +30,7 @@
     </w:p>
     <w:p>
       <w:r>
-        <w:t xml:space="preserve">const cannot be changed while var and let can be changed to not only a new value but another data </w:t>
-      </w:r>
-      <w:proofErr w:type="gramStart"/>
-      <w:r>
-        <w:t>type</w:t>
-      </w:r>
-      <w:proofErr w:type="gramEnd"/>
-      <w:r>
-        <w:t xml:space="preserve"> the same as in python</w:t>
+        <w:t>const cannot be changed while var and let can be changed to not only a new value but another data type the same as in python</w:t>
       </w:r>
     </w:p>
     <w:p/>
@@ -54,44 +46,286 @@
     </w:p>
     <w:p>
       <w:r>
-        <w:t xml:space="preserve">variables are case </w:t>
-      </w:r>
-      <w:proofErr w:type="spellStart"/>
-      <w:r>
-        <w:t>sensititve</w:t>
-      </w:r>
-      <w:proofErr w:type="spellEnd"/>
-      <w:r>
-        <w:t xml:space="preserve"> in </w:t>
-      </w:r>
-      <w:proofErr w:type="spellStart"/>
-      <w:r>
-        <w:t>javascript</w:t>
-      </w:r>
-      <w:proofErr w:type="spellEnd"/>
-      <w:r>
-        <w:t xml:space="preserve"> </w:t>
-      </w:r>
-    </w:p>
-    <w:p>
-      <w:proofErr w:type="spellStart"/>
-      <w:r>
-        <w:t>camelCasing</w:t>
-      </w:r>
-      <w:proofErr w:type="spellEnd"/>
-      <w:r>
-        <w:t xml:space="preserve"> is used with the </w:t>
-      </w:r>
-      <w:proofErr w:type="spellStart"/>
-      <w:r>
-        <w:t>javascript</w:t>
-      </w:r>
-      <w:proofErr w:type="spellEnd"/>
-      <w:r>
-        <w:t xml:space="preserve"> variables the same its used with java variables</w:t>
-      </w:r>
-    </w:p>
-    <w:p/>
+        <w:t xml:space="preserve">variables are case sensititve in javascript </w:t>
+      </w:r>
+    </w:p>
+    <w:p>
+      <w:r>
+        <w:t>camelCasing is used with the javascript variables the same its used with java variables</w:t>
+      </w:r>
+    </w:p>
+    <w:p>
+      <w:r>
+        <w:t>addition, multiplication, division, and subtraction is the same as any programming language</w:t>
+      </w:r>
+    </w:p>
+    <w:p>
+      <w:r>
+        <w:t>incrementation and decrementation is also the same as in java , the remainder is the same</w:t>
+      </w:r>
+    </w:p>
+    <w:p>
+      <w:r>
+        <w:t>unlike java when we multiply a floating or decimal number to an integer in case the result is a whole number we get an integer</w:t>
+      </w:r>
+    </w:p>
+    <w:p/>
+    <w:p>
+      <w:r>
+        <w:t xml:space="preserve">a += 1 is the same as a = a + 1; and it works the same in java </w:t>
+      </w:r>
+    </w:p>
+    <w:p>
+      <w:r>
+        <w:t>the escape sequence or escape character works the same as in java no additions</w:t>
+      </w:r>
+    </w:p>
+    <w:p>
+      <w:r>
+        <w:t xml:space="preserve">we can concatenate the same way in java when using the + </w:t>
+      </w:r>
+    </w:p>
+    <w:p>
+      <w:r>
+        <w:t xml:space="preserve">we can concatenate the strings using += </w:t>
+      </w:r>
+    </w:p>
+    <w:p>
+      <w:r>
+        <w:t>the strings also have the .length as in java except in java we need () so str.length() in java and str.length in JS</w:t>
+      </w:r>
+    </w:p>
+    <w:p>
+      <w:r>
+        <w:lastRenderedPageBreak/>
+        <w:t>unlike java we can slice a String using the indexing like in python so name[0] gets the first character in the string called name this does not work in java but still can work like in java where we can do this str.charAt(index</w:t>
+      </w:r>
+      <w:r>
+        <w:t xml:space="preserve"> = 0</w:t>
+      </w:r>
+      <w:r>
+        <w:t>)</w:t>
+      </w:r>
+    </w:p>
+    <w:p/>
+    <w:p>
+      <w:r>
+        <w:t>String j=in java script are immutable which means they cannot be changed rather they can be entirely replaced so it means we cannot do this mystr[0] = “a”</w:t>
+      </w:r>
+    </w:p>
+    <w:p>
+      <w:r>
+        <w:t>but we can do this mystr = “new”</w:t>
+      </w:r>
+    </w:p>
+    <w:p>
+      <w:r>
+        <w:t>the exact same works for java</w:t>
+      </w:r>
+    </w:p>
+    <w:p>
+      <w:r>
+        <w:t>we can get the last element using the index str.charAt(str.length - 1)</w:t>
+      </w:r>
+    </w:p>
+    <w:p>
+      <w:r>
+        <w:t xml:space="preserve">invalid = </w:t>
+      </w:r>
+      <w:r>
+        <w:rPr>
+          <w:i/>
+          <w:iCs/>
+        </w:rPr>
+        <w:t>myName</w:t>
+      </w:r>
+      <w:r>
+        <w:t>[-1]</w:t>
+      </w:r>
+    </w:p>
+    <w:p/>
+    <w:p>
+      <w:r>
+        <w:t>to define a function what we can do is: function function_name(parameters){</w:t>
+      </w:r>
+    </w:p>
+    <w:p>
+      <w:r>
+        <w:t>behavior</w:t>
+      </w:r>
+    </w:p>
+    <w:p>
+      <w:r>
+        <w:t>returns</w:t>
+      </w:r>
+    </w:p>
+    <w:p>
+      <w:r>
+        <w:t>}</w:t>
+      </w:r>
+    </w:p>
+    <w:p/>
+    <w:p>
+      <w:r>
+        <w:t xml:space="preserve">var array = arr[number, float, string]; </w:t>
+      </w:r>
+    </w:p>
+    <w:p/>
+    <w:p>
+      <w:r>
+        <w:t>a nested array is an array within the array, it can be accessed with indexes as well</w:t>
+      </w:r>
+    </w:p>
+    <w:p>
+      <w:r>
+        <w:t xml:space="preserve">accessing data in a nested or multi dimension array is the same as python and java arr[row][column] </w:t>
+      </w:r>
+    </w:p>
+    <w:p/>
+    <w:p>
+      <w:r>
+        <w:t>we can append to the end of the array using arr.push()</w:t>
+      </w:r>
+    </w:p>
+    <w:p>
+      <w:r>
+        <w:t>the .pop() returns and remove the last element of the array</w:t>
+      </w:r>
+    </w:p>
+    <w:p>
+      <w:r>
+        <w:t>the .shift() works the same as pop but from the opposite side</w:t>
+      </w:r>
+    </w:p>
+    <w:p>
+      <w:r>
+        <w:t>the .unshift() adds an element to the beginning of the array</w:t>
+      </w:r>
+    </w:p>
+    <w:p/>
+    <w:p>
+      <w:r>
+        <w:lastRenderedPageBreak/>
+        <w:t>in java script objects are variables that store property and value in a JSON format way</w:t>
+      </w:r>
+    </w:p>
+    <w:p>
+      <w:r>
+        <w:t>we can delete a property in a javascript object by simply delete classname.propertyname</w:t>
+      </w:r>
+    </w:p>
+    <w:p/>
+    <w:p>
+      <w:r>
+        <w:t>we can check if an obj has its own property by simply using obj.hasownprop</w:t>
+      </w:r>
+    </w:p>
+    <w:p/>
+    <w:p>
+      <w:r>
+        <w:t>while works the same in java</w:t>
+      </w:r>
+    </w:p>
+    <w:p>
+      <w:r>
+        <w:t>for works also the same</w:t>
+      </w:r>
+    </w:p>
+    <w:p/>
+    <w:p>
+      <w:r>
+        <w:t>Math.random() works the same as in python it can be anywhere from 0 to less than one</w:t>
+      </w:r>
+    </w:p>
+    <w:p/>
+    <w:p>
+      <w:r>
+        <w:t>we also have parseInt() from java</w:t>
+      </w:r>
+    </w:p>
+    <w:p>
+      <w:r>
+        <w:t>while parsing we can specify the base of the number that we are trying to parse in case of binary we can do ParseInt(number, 2)</w:t>
+      </w:r>
+    </w:p>
+    <w:p/>
+    <w:p>
+      <w:r>
+        <w:t xml:space="preserve">the ternary operator works the same as in java </w:t>
+      </w:r>
+    </w:p>
+    <w:p>
+      <w:r>
+        <w:t>return  1 === 1 ? true: false;</w:t>
+      </w:r>
+    </w:p>
+    <w:p>
+      <w:r>
+        <w:t>we can nest the ternary operators</w:t>
+      </w:r>
+    </w:p>
+    <w:p>
+      <w:r>
+        <w:t>return 1 === 2 ? true : return 1===1 ? true : return 1 == ’1’ ? zero : false</w:t>
+      </w:r>
+    </w:p>
+    <w:p/>
+    <w:p>
+      <w:r>
+        <w:t>even in constant array we can update values based on their index</w:t>
+      </w:r>
+    </w:p>
+    <w:p/>
+    <w:p>
+      <w:r>
+        <w:t xml:space="preserve">in constant objects there is the concept of data.freeze </w:t>
+      </w:r>
+    </w:p>
+    <w:p>
+      <w:r>
+        <w:t xml:space="preserve">where we cannot access the elements of the object and manipulate it </w:t>
+      </w:r>
+    </w:p>
+    <w:p/>
+    <w:p>
+      <w:r>
+        <w:t>Object.freeze(objectname);</w:t>
+      </w:r>
+    </w:p>
+    <w:p/>
+    <w:p>
+      <w:r>
+        <w:lastRenderedPageBreak/>
+        <w:t>while creating or declaring a function we can pass in a default value for a parameter in case its not passed</w:t>
+      </w:r>
+    </w:p>
+    <w:p/>
+    <w:p>
+      <w:r>
+        <w:t xml:space="preserve">we have the same idea of var args from java using the … </w:t>
+      </w:r>
+    </w:p>
+    <w:p>
+      <w:r>
+        <w:t>we can use the var args operator to make a copy of an array inside the other</w:t>
+      </w:r>
+    </w:p>
+    <w:p/>
+    <w:p>
+      <w:r>
+        <w:t>to quickly assign values from an object into variables we can use something called destructor</w:t>
+      </w:r>
+    </w:p>
+    <w:p>
+      <w:r>
+        <w:t>const { parameter : new parameter , obj_param : new parameter } = object</w:t>
+      </w:r>
+    </w:p>
+    <w:p>
+      <w:r>
+        <w:t>now these new parameters hold the values of the object</w:t>
+      </w:r>
+    </w:p>
     <w:sectPr>
       <w:pgSz w:w="12240" w:h="15840"/>
       <w:pgMar w:top="1440" w:right="1800" w:bottom="1440" w:left="1800" w:header="720" w:footer="720" w:gutter="0"/>
@@ -705,6 +939,7 @@
   <w:style w:type="character" w:default="1" w:styleId="DefaultParagraphFont">
     <w:name w:val="Default Paragraph Font"/>
     <w:uiPriority w:val="1"/>
+    <w:semiHidden/>
     <w:unhideWhenUsed/>
   </w:style>
   <w:style w:type="table" w:default="1" w:styleId="TableNormal">
@@ -1016,6 +1251,36 @@
       <w:smallCaps/>
       <w:color w:val="2F5496" w:themeColor="accent1" w:themeShade="BF"/>
       <w:spacing w:val="5"/>
+    </w:rPr>
+  </w:style>
+  <w:style w:type="paragraph" w:styleId="HTMLPreformatted">
+    <w:name w:val="HTML Preformatted"/>
+    <w:basedOn w:val="Normal"/>
+    <w:link w:val="HTMLPreformattedChar"/>
+    <w:uiPriority w:val="99"/>
+    <w:semiHidden/>
+    <w:unhideWhenUsed/>
+    <w:rsid w:val="00845407"/>
+    <w:pPr>
+      <w:spacing w:after="0" w:line="240" w:lineRule="auto"/>
+    </w:pPr>
+    <w:rPr>
+      <w:rFonts w:ascii="Consolas" w:hAnsi="Consolas"/>
+      <w:sz w:val="20"/>
+      <w:szCs w:val="20"/>
+    </w:rPr>
+  </w:style>
+  <w:style w:type="character" w:customStyle="1" w:styleId="HTMLPreformattedChar">
+    <w:name w:val="HTML Preformatted Char"/>
+    <w:basedOn w:val="DefaultParagraphFont"/>
+    <w:link w:val="HTMLPreformatted"/>
+    <w:uiPriority w:val="99"/>
+    <w:semiHidden/>
+    <w:rsid w:val="00845407"/>
+    <w:rPr>
+      <w:rFonts w:ascii="Consolas" w:hAnsi="Consolas"/>
+      <w:sz w:val="20"/>
+      <w:szCs w:val="20"/>
     </w:rPr>
   </w:style>
 </w:styles>

</xml_diff>